<commit_message>
Strengthen both demo intros (author read-aloud pass)
Reran slop-scan on both pieces; the authored openers buried the thesis behind
warm-up. Report §1: cut concession-before-thesis and the split/double-hedged
thesis — it now fires with conviction and a single calibrated hedge. Blog: cut
three stacked opener clichés and promoted the thesis to the first sentence,
keeping the self-disclosure as texture. Also fixed a dangling em-dash parallel,
a "got me" tic (3→1), and a doubled "than". Independently verified RESOLVED.
Re-rendered .docx; decision log + v2 scans added.

Co-Authored-By: Claude Opus 4.8 <noreply@anthropic.com>
</commit_message>
<xml_diff>
--- a/demo/10b_blog-post.docx
+++ b/demo/10b_blog-post.docx
@@ -16,7 +16,7 @@
         <w:pStyle w:val="FirstParagraph"/>
       </w:pPr>
       <w:r>
-        <w:t xml:space="preserve">I fell down a rabbit hole in the 1949 literature last week and I can’t stop thinking about it. Short version: we treat the three poliovirus serotypes as a hard fact of nature — type 1, type 2, type 3, clean boxes — and part of that hardness is something we manufactured in the 1950s. Read the papers from before the cleanup and the picture is a lot less black and white than the dogma I was handed.</w:t>
+        <w:t xml:space="preserve">We treat the three poliovirus serotypes as a hard fact of nature — type 1, type 2, type 3, clean boxes — and part of that hardness is something we manufactured in the 1950s. I went digging in the 1949 literature last week, and the people who first sorted these viruses weren’t nearly as sure the boxes were clean. Read the papers from before the cleanup and the story is fuzzier than the dogma I was handed.</w:t>
       </w:r>
     </w:p>
     <w:bookmarkStart w:id="9" w:name="what-they-knew-before-they-tidied-it-up"/>
@@ -33,7 +33,7 @@
         <w:pStyle w:val="FirstParagraph"/>
       </w:pPr>
       <w:r>
-        <w:t xml:space="preserve">Here’s the thing that got me. Way back, they</w:t>
+        <w:t xml:space="preserve">Here’s the thing. Way back, they</w:t>
       </w:r>
       <w:r>
         <w:t xml:space="preserve"> </w:t>
@@ -165,7 +165,7 @@
         <w:pStyle w:val="FirstParagraph"/>
       </w:pPr>
       <w:r>
-        <w:t xml:space="preserve">Here’s the part that gets me. This is old, small-N data, sure. But it comes from a moment when genetic diversity was high, population immunity across serotypes wasn’t yet synchronized by trivalent vaccines, and — before we built the assays and algorithms specifically to remove this ambiguity. In the early ’50s, cell culture and the three-type scheme were standardized together for vaccine development. Everyone stopped fussing with the old monkey-isolated strains and referenced everything to a handful of prototypes. Most of those other names just… vanish from the literature. Of the fourteen strains in Bodian’s grouping, only four survived to be sequenced decades later. And honestly? If your job is to vaccinate against three types, none of the lost nuance matters. But in the canonizing of stylized facts, we lost the common knowledge that the story is fuzzy.</w:t>
+        <w:t xml:space="preserve">And here’s the kicker. This is old, small-N data, sure. But it comes from a moment when genetic diversity was high, when population immunity across serotypes wasn’t yet synchronized by trivalent vaccines, and before we’d built the assays and algorithms specifically to remove this ambiguity. In the early ’50s, cell culture and the three-type scheme were standardized together for vaccine development. Everyone stopped fussing with the old monkey-isolated strains and referenced everything to a handful of prototypes. Most of those other names just… vanish from the literature. Of the fourteen strains in Bodian’s grouping, only four survived to be sequenced decades later. And honestly? If your job is to vaccinate against three types, none of the lost nuance matters. But in the canonizing of stylized facts, we lost the common knowledge that the story is fuzzy.</w:t>
       </w:r>
     </w:p>
     <w:bookmarkEnd w:id="11"/>

</xml_diff>